<commit_message>
YC02: thêm file Word làm rõ 5 bullet listing cho từng sản phẩm
Co-Authored-By: Claude Opus 5.5 <noreply@anthropic.com>
Claude-Session: https://claude.ai/code/session_01YQUcqjZGKvmuBKSf6hPFN4
</commit_message>
<xml_diff>
--- a/yeu-cau-02/SIXDO_YeuCau02_ChienLuocAmazon.docx
+++ b/yeu-cau-02/SIXDO_YeuCau02_ChienLuocAmazon.docx
@@ -4849,7 +4849,16 @@
     </w:p>
     <w:p>
       <w:r>
-        <w:t xml:space="preserve">Thứ tự: dịp dùng → thương hiệu → chất liệu → size (inch) → cách giặt. Phần [ ] là số liệu thật, phải điền trước khi đăng. Không claim "true to size", "warm" hay "non-see-through" khi chưa kiểm chứng.</w:t>
+        <w:t xml:space="preserve">Bản đầy đủ 5 bullet của từng sản phẩm, kèm nghĩa tiếng Việt và cách điền số liệu, nằm ở file riêng </w:t>
+      </w:r>
+      <w:r>
+        <w:rPr>
+          <w:i/>
+        </w:rPr>
+        <w:t xml:space="preserve">SIXDO_YeuCau02_Bullet_LamRo</w:t>
+      </w:r>
+      <w:r>
+        <w:t xml:space="preserve">. Thứ tự: dịp dùng → thương hiệu → chất liệu → size (inch) → cách giặt. Phần [ ] là số liệu thật, phải điền trước khi đăng. Không claim "true to size", "warm" hay "non-see-through" khi chưa kiểm chứng.</w:t>
       </w:r>
     </w:p>
     <w:p>
@@ -13960,7 +13969,7 @@
       <w:rPr>
         <w:sz w:val="16"/>
       </w:rPr>
-      <w:t>SIXDO  |  YÊU CẦU 02 – CHIẾN LƯỢC AMAZON  |  30 09 2026</w:t>
+      <w:t>SIXDO | YÊU CẦU 02 | AMAZON US</w:t>
     </w:r>
   </w:p>
 </w:hdr>

</xml_diff>

<commit_message>
YC02: sửa bullet listing dựa trên bullet đang có trên Amazon
Co-Authored-By: Claude Opus 5.5 <noreply@anthropic.com>
Claude-Session: https://claude.ai/code/session_01YQUcqjZGKvmuBKSf6hPFN4
</commit_message>
<xml_diff>
--- a/yeu-cau-02/SIXDO_YeuCau02_ChienLuocAmazon.docx
+++ b/yeu-cau-02/SIXDO_YeuCau02_ChienLuocAmazon.docx
@@ -4849,7 +4849,7 @@
     </w:p>
     <w:p>
       <w:r>
-        <w:t xml:space="preserve">Bản đầy đủ 5 bullet của từng sản phẩm, kèm nghĩa tiếng Việt và cách điền số liệu, nằm ở file riêng </w:t>
+        <w:t xml:space="preserve">Bản đầy đủ 5 bullet của từng sản phẩm, sửa từ bullet đang có trên Amazon, nằm ở file riêng </w:t>
       </w:r>
       <w:r>
         <w:rPr>
@@ -4936,7 +4936,7 @@
                 <w:b/>
                 <w:sz w:val="18"/>
               </w:rPr>
-              <w:t xml:space="preserve">SP1 (cotton)</w:t>
+              <w:t xml:space="preserve">SP1 (cotton, theo nhãn)</w:t>
             </w:r>
           </w:p>
         </w:tc>
@@ -4960,7 +4960,7 @@
                 <w:b/>
                 <w:sz w:val="18"/>
               </w:rPr>
-              <w:t xml:space="preserve">SP2 (polyester voile)</w:t>
+              <w:t xml:space="preserve">SP2 (100% polyester voile)</w:t>
             </w:r>
           </w:p>
         </w:tc>
@@ -4984,7 +4984,7 @@
                 <w:b/>
                 <w:sz w:val="18"/>
               </w:rPr>
-              <w:t xml:space="preserve">SP3 (polyester)</w:t>
+              <w:t xml:space="preserve">SP3 (100% polyester)</w:t>
             </w:r>
           </w:p>
         </w:tc>
@@ -5038,7 +5038,7 @@
                 <w:rFonts w:ascii="Consolas" w:hAnsi="Consolas" w:cs="Consolas"/>
                 <w:sz w:val="18"/>
               </w:rPr>
-              <w:t xml:space="preserve">MADE FOR WARM-WEATHER PLANS – For vacations, cruises, resort dinners, brunch and daytime weddings.</w:t>
+              <w:t xml:space="preserve">MADE FOR WARM-WEATHER PLANS – For vacations, cruises, travel days, resort dinners and brunch.</w:t>
             </w:r>
           </w:p>
         </w:tc>
@@ -5063,7 +5063,7 @@
                 <w:rFonts w:ascii="Consolas" w:hAnsi="Consolas" w:cs="Consolas"/>
                 <w:sz w:val="18"/>
               </w:rPr>
-              <w:t xml:space="preserve">ONE DRESS FOR FALL EVENTS AND TRIPS – For fall gatherings, daytime weddings as a guest and trips to warmer places.</w:t>
+              <w:t xml:space="preserve">ONE DRESS FOR FALL EVENTS AND TRIPS – A gentle flare from the waist; for fall gatherings, daytime weddings as a guest, brunch and getaways.</w:t>
             </w:r>
           </w:p>
         </w:tc>
@@ -5088,7 +5088,7 @@
                 <w:rFonts w:ascii="Consolas" w:hAnsi="Consolas" w:cs="Consolas"/>
                 <w:sz w:val="18"/>
               </w:rPr>
-              <w:t xml:space="preserve">DRESS IT UP OR LAYER IT – For [holiday parties, New Year's Eve / Valentine's Day, Easter brunch]. Add a blazer or tights when it's cold.</w:t>
+              <w:t xml:space="preserve">DRESS IT UP OR LAYER IT – Sleeveless high-waist A-line, open back; for [holiday parties, New Year's Eve / Valentine's Day, Easter brunch]. Add a blazer or tights when it's cold.</w:t>
             </w:r>
           </w:p>
         </w:tc>
@@ -5142,7 +5142,7 @@
                 <w:rFonts w:ascii="Consolas" w:hAnsi="Consolas" w:cs="Consolas"/>
                 <w:sz w:val="18"/>
               </w:rPr>
-              <w:t xml:space="preserve">WOVEN COTTON, HONEST DETAILS – [100]% cotton. Lining: [ ]. In bright light: [not / slightly] see-through.</w:t>
+              <w:t xml:space="preserve">BREATHABLE WOVEN FABRIC – [cotton / rayon-cotton blend] per label. Pull-on, no zip. [Not / slightly] see-through.</w:t>
             </w:r>
           </w:p>
         </w:tc>
@@ -5167,7 +5167,7 @@
                 <w:rFonts w:ascii="Consolas" w:hAnsi="Consolas" w:cs="Consolas"/>
                 <w:sz w:val="18"/>
               </w:rPr>
-              <w:t xml:space="preserve">IS IT SHEER? – Sleeves are sheer voile by design. Body: [lined / unlined]. A breathable layer, not a warm winter fabric.</w:t>
+              <w:t xml:space="preserve">IS IT SHEER? – Sleeves are sheer voile by design. Body: [lined / unlined]. 100% polyester voile, not a warm winter fabric. Zip closure.</w:t>
             </w:r>
           </w:p>
         </w:tc>
@@ -5192,7 +5192,7 @@
                 <w:rFonts w:ascii="Consolas" w:hAnsi="Consolas" w:cs="Consolas"/>
                 <w:sz w:val="18"/>
               </w:rPr>
-              <w:t xml:space="preserve">SOLID POLYESTER, CLEAR FACTS – [lined / unlined], [opaque / slightly see-through].</w:t>
+              <w:t xml:space="preserve">SOLID POLYESTER, CLEAR FACTS – 100% polyester, [lined / unlined], [opaque / slightly see-through]. Pull-on, open back.</w:t>
             </w:r>
           </w:p>
         </w:tc>
@@ -5261,7 +5261,7 @@
                 <w:rFonts w:ascii="Consolas" w:hAnsi="Consolas" w:cs="Consolas"/>
                 <w:sz w:val="18"/>
               </w:rPr>
-              <w:t xml:space="preserve">CARE – Hand wash cold.</w:t>
+              <w:t xml:space="preserve">CARE – Hand wash only.</w:t>
             </w:r>
           </w:p>
         </w:tc>
@@ -5286,7 +5286,7 @@
                 <w:rFonts w:ascii="Consolas" w:hAnsi="Consolas" w:cs="Consolas"/>
                 <w:sz w:val="18"/>
               </w:rPr>
-              <w:t xml:space="preserve">FIND YOUR SIZE IN INCHES – bust, waist, length, sleeve [ ].</w:t>
+              <w:t xml:space="preserve">FIND YOUR SIZE IN INCHES – S (4–6) to XXL (20–22); chart in images.</w:t>
             </w:r>
             <w:r>
               <w:rPr>
@@ -5301,7 +5301,7 @@
                 <w:rFonts w:ascii="Consolas" w:hAnsi="Consolas" w:cs="Consolas"/>
                 <w:sz w:val="18"/>
               </w:rPr>
-              <w:t xml:space="preserve">CARE – [ ].</w:t>
+              <w:t xml:space="preserve">CARE – Hand wash only.</w:t>
             </w:r>
           </w:p>
         </w:tc>
@@ -5341,7 +5341,7 @@
                 <w:rFonts w:ascii="Consolas" w:hAnsi="Consolas" w:cs="Consolas"/>
                 <w:sz w:val="18"/>
               </w:rPr>
-              <w:t xml:space="preserve">CARE – [ ].</w:t>
+              <w:t xml:space="preserve">CARE – Hand wash recommended.</w:t>
             </w:r>
           </w:p>
         </w:tc>

</xml_diff>

<commit_message>
YC02: bullet tối ưu dựa trên bullet gốc và phân tích bullet đối thủ
Co-Authored-By: Claude Opus 5.5 <noreply@anthropic.com>
Claude-Session: https://claude.ai/code/session_01YQUcqjZGKvmuBKSf6hPFN4
</commit_message>
<xml_diff>
--- a/yeu-cau-02/SIXDO_YeuCau02_ChienLuocAmazon.docx
+++ b/yeu-cau-02/SIXDO_YeuCau02_ChienLuocAmazon.docx
@@ -4623,7 +4623,7 @@
                 <w:b w:val="0"/>
                 <w:sz w:val="18"/>
               </w:rPr>
-              <w:t xml:space="preserve">A (tay dài): </w:t>
+              <w:t xml:space="preserve">A (tay dài, ảnh listing đã xác nhận, dùng bản này): </w:t>
             </w:r>
             <w:r>
               <w:rPr>
@@ -4849,7 +4849,7 @@
     </w:p>
     <w:p>
       <w:r>
-        <w:t xml:space="preserve">Bản đầy đủ 5 bullet của từng sản phẩm, sửa từ bullet đang có trên Amazon, nằm ở file riêng </w:t>
+        <w:t xml:space="preserve">Bullet hiện tại có 3 lỗi. SP2 và SP3 dùng chung y hệt 5 bullet. Không bullet nào ghi vải, lót hay size. Bullet 5 là danh sách từ khóa. Đối thủ giá 30 USD (PRETTYGARDEN, ZESICA) ghi đủ thành phần, "fully lined" và quy đổi size Mỹ. Bản đầy đủ, gồm bullet gốc, phân tích đối thủ và bullet mới, nằm ở file riêng </w:t>
       </w:r>
       <w:r>
         <w:rPr>
@@ -4858,21 +4858,12 @@
         <w:t xml:space="preserve">SIXDO_YeuCau02_Bullet_LamRo</w:t>
       </w:r>
       <w:r>
-        <w:t xml:space="preserve">. Thứ tự: dịp dùng → thương hiệu → chất liệu → size (inch) → cách giặt. Phần [ ] là số liệu thật, phải điền trước khi đăng. Không claim "true to size", "warm" hay "non-see-through" khi chưa kiểm chứng.</w:t>
+        <w:t xml:space="preserve">.</w:t>
       </w:r>
     </w:p>
     <w:p>
       <w:r>
-        <w:t xml:space="preserve">Bullet 2 dùng chung cho cả ba sản phẩm: </w:t>
-      </w:r>
-      <w:r>
-        <w:rPr>
-          <w:rFonts w:ascii="Consolas" w:hAnsi="Consolas" w:cs="Consolas"/>
-        </w:rPr>
-        <w:t xml:space="preserve">FROM A RUNWAY DESIGN HOUSE – SIXDO is a Vietnamese fashion brand whose collections have been shown at New York Fashion Week.</w:t>
-      </w:r>
-      <w:r>
-        <w:t xml:space="preserve"> Đây là thành tích của thương hiệu, không phải của từng mẫu.</w:t>
+        <w:t xml:space="preserve">Thứ tự bullet mới: dịp dùng → vải, lót, độ xuyên → chi tiết thiết kế và NYFW → size → cách giặt. Phần [ ] là số liệu thật, phải điền trước khi đăng. Không claim "true to size", "warm" hay "non-see-through" khi chưa kiểm chứng.</w:t>
       </w:r>
     </w:p>
     <w:tbl>
@@ -4936,7 +4927,7 @@
                 <w:b/>
                 <w:sz w:val="18"/>
               </w:rPr>
-              <w:t xml:space="preserve">SP1 (cotton, theo nhãn)</w:t>
+              <w:t xml:space="preserve">SP1</w:t>
             </w:r>
           </w:p>
         </w:tc>
@@ -4960,7 +4951,7 @@
                 <w:b/>
                 <w:sz w:val="18"/>
               </w:rPr>
-              <w:t xml:space="preserve">SP2 (100% polyester voile)</w:t>
+              <w:t xml:space="preserve">SP2</w:t>
             </w:r>
           </w:p>
         </w:tc>
@@ -4984,7 +4975,7 @@
                 <w:b/>
                 <w:sz w:val="18"/>
               </w:rPr>
-              <w:t xml:space="preserve">SP3 (100% polyester)</w:t>
+              <w:t xml:space="preserve">SP3</w:t>
             </w:r>
           </w:p>
         </w:tc>
@@ -5038,7 +5029,7 @@
                 <w:rFonts w:ascii="Consolas" w:hAnsi="Consolas" w:cs="Consolas"/>
                 <w:sz w:val="18"/>
               </w:rPr>
-              <w:t xml:space="preserve">MADE FOR WARM-WEATHER PLANS – For vacations, cruises, travel days, resort dinners and brunch.</w:t>
+              <w:t xml:space="preserve">WARM-WEATHER PLANS, DAY TO NIGHT: vacations, cruises, resort dinners, brunch</w:t>
             </w:r>
           </w:p>
         </w:tc>
@@ -5063,7 +5054,7 @@
                 <w:rFonts w:ascii="Consolas" w:hAnsi="Consolas" w:cs="Consolas"/>
                 <w:sz w:val="18"/>
               </w:rPr>
-              <w:t xml:space="preserve">ONE DRESS FOR FALL EVENTS AND TRIPS – A gentle flare from the waist; for fall gatherings, daytime weddings as a guest, brunch and getaways.</w:t>
+              <w:t xml:space="preserve">FALL EVENTS AND WARM GETAWAYS: fall gatherings, Thanksgiving, wedding guest, trips</w:t>
             </w:r>
           </w:p>
         </w:tc>
@@ -5082,13 +5073,40 @@
             <w:pPr>
               <w:spacing w:after="60" w:before="60"/>
             </w:pPr>
+            <w:r>
+              <w:rPr>
+                <w:b w:val="0"/>
+                <w:sz w:val="18"/>
+              </w:rPr>
+              <w:t xml:space="preserve">Đen: </w:t>
+            </w:r>
             <w:r>
               <w:rPr>
                 <w:b w:val="0"/>
                 <w:rFonts w:ascii="Consolas" w:hAnsi="Consolas" w:cs="Consolas"/>
                 <w:sz w:val="18"/>
               </w:rPr>
-              <w:t xml:space="preserve">DRESS IT UP OR LAYER IT – Sleeveless high-waist A-line, open back; for [holiday parties, New Year's Eve / Valentine's Day, Easter brunch]. Add a blazer or tights when it's cold.</w:t>
+              <w:t xml:space="preserve">HOLIDAY PARTIES TO NEW YEAR'S EVE</w:t>
+            </w:r>
+          </w:p>
+          <w:p>
+            <w:pPr>
+              <w:spacing w:after="60" w:before="60"/>
+            </w:pPr>
+            <w:r>
+              <w:rPr>
+                <w:b w:val="0"/>
+                <w:sz w:val="18"/>
+              </w:rPr>
+              <w:t xml:space="preserve">Hồng: </w:t>
+            </w:r>
+            <w:r>
+              <w:rPr>
+                <w:b w:val="0"/>
+                <w:rFonts w:ascii="Consolas" w:hAnsi="Consolas" w:cs="Consolas"/>
+                <w:sz w:val="18"/>
+              </w:rPr>
+              <w:t xml:space="preserve">VALENTINE'S DAY TO EASTER</w:t>
             </w:r>
           </w:p>
         </w:tc>
@@ -5117,7 +5135,7 @@
                 <w:b w:val="0"/>
                 <w:sz w:val="18"/>
               </w:rPr>
-              <w:t xml:space="preserve">3. Chất liệu</w:t>
+              <w:t xml:space="preserve">2. Vải</w:t>
             </w:r>
           </w:p>
         </w:tc>
@@ -5142,7 +5160,7 @@
                 <w:rFonts w:ascii="Consolas" w:hAnsi="Consolas" w:cs="Consolas"/>
                 <w:sz w:val="18"/>
               </w:rPr>
-              <w:t xml:space="preserve">BREATHABLE WOVEN FABRIC – [cotton / rayon-cotton blend] per label. Pull-on, no zip. [Not / slightly] see-through.</w:t>
+              <w:t xml:space="preserve">BREATHABLE WOVEN FABRIC: [fiber] per label, [lining], [see-through test], pull-on</w:t>
             </w:r>
           </w:p>
         </w:tc>
@@ -5167,7 +5185,7 @@
                 <w:rFonts w:ascii="Consolas" w:hAnsi="Consolas" w:cs="Consolas"/>
                 <w:sz w:val="18"/>
               </w:rPr>
-              <w:t xml:space="preserve">IS IT SHEER? – Sleeves are sheer voile by design. Body: [lined / unlined]. 100% polyester voile, not a warm winter fabric. Zip closure.</w:t>
+              <w:t xml:space="preserve">IS IT SHEER? Sheer voile sleeves by design; body [lined]; 100% polyester</w:t>
             </w:r>
           </w:p>
         </w:tc>
@@ -5192,7 +5210,7 @@
                 <w:rFonts w:ascii="Consolas" w:hAnsi="Consolas" w:cs="Consolas"/>
                 <w:sz w:val="18"/>
               </w:rPr>
-              <w:t xml:space="preserve">SOLID POLYESTER, CLEAR FACTS – 100% polyester, [lined / unlined], [opaque / slightly see-through]. Pull-on, open back.</w:t>
+              <w:t xml:space="preserve">SOLID FABRIC, CLEAR FACTS: 100% polyester, [lined], [opaque], pull-on</w:t>
             </w:r>
           </w:p>
         </w:tc>
@@ -5221,7 +5239,7 @@
                 <w:b w:val="0"/>
                 <w:sz w:val="18"/>
               </w:rPr>
-              <w:t xml:space="preserve">4–5. Size, giặt</w:t>
+              <w:t xml:space="preserve">3. Thiết kế</w:t>
             </w:r>
           </w:p>
         </w:tc>
@@ -5246,28 +5264,38 @@
                 <w:rFonts w:ascii="Consolas" w:hAnsi="Consolas" w:cs="Consolas"/>
                 <w:sz w:val="18"/>
               </w:rPr>
-              <w:t xml:space="preserve">FIND YOUR SIZE IN INCHES – bust, waist, hip, inseam [ ]; model wears [ ].</w:t>
-            </w:r>
-            <w:r>
-              <w:rPr>
-                <w:b w:val="0"/>
-                <w:sz w:val="18"/>
-              </w:rPr>
-              <w:t xml:space="preserve"> · </w:t>
-            </w:r>
+              <w:t xml:space="preserve">ONE PIECE, COMPLETE LOOK: border-print hem, wide legs; SIXDO, shown at NYFW</w:t>
+            </w:r>
+          </w:p>
+        </w:tc>
+        <w:tc>
+          <w:tcPr>
+            <w:tcW w:type="dxa" w:w="3037"/>
+            <w:tcBorders>
+              <w:top w:val="single" w:sz="4" w:color="D9D9D9"/>
+              <w:left w:val="single" w:sz="4" w:color="D9D9D9"/>
+              <w:bottom w:val="single" w:sz="4" w:color="D9D9D9"/>
+              <w:right w:val="single" w:sz="4" w:color="D9D9D9"/>
+            </w:tcBorders>
+            <w:shd w:val="clear" w:color="auto" w:fill="FFFFFF"/>
+          </w:tcPr>
+          <w:p>
+            <w:pPr>
+              <w:spacing w:after="60" w:before="60"/>
+            </w:pPr>
             <w:r>
               <w:rPr>
                 <w:b w:val="0"/>
                 <w:rFonts w:ascii="Consolas" w:hAnsi="Consolas" w:cs="Consolas"/>
                 <w:sz w:val="18"/>
               </w:rPr>
-              <w:t xml:space="preserve">CARE – Hand wash only.</w:t>
-            </w:r>
-          </w:p>
-        </w:tc>
-        <w:tc>
-          <w:tcPr>
-            <w:tcW w:type="dxa" w:w="3037"/>
+              <w:t xml:space="preserve">RUNWAY DETAILS YOU CAN SEE: balloon sleeves, tie neck, drawstring waist, tiers</w:t>
+            </w:r>
+          </w:p>
+        </w:tc>
+        <w:tc>
+          <w:tcPr>
+            <w:tcW w:type="dxa" w:w="3040"/>
             <w:tcBorders>
               <w:top w:val="single" w:sz="4" w:color="D9D9D9"/>
               <w:left w:val="single" w:sz="4" w:color="D9D9D9"/>
@@ -5286,62 +5314,156 @@
                 <w:rFonts w:ascii="Consolas" w:hAnsi="Consolas" w:cs="Consolas"/>
                 <w:sz w:val="18"/>
               </w:rPr>
-              <w:t xml:space="preserve">FIND YOUR SIZE IN INCHES – S (4–6) to XXL (20–22); chart in images.</w:t>
-            </w:r>
+              <w:t xml:space="preserve">DESIGNED BY SIXDO: fitted bodice, tiered skirt, NYFW brand at an everyday price</w:t>
+            </w:r>
+          </w:p>
+        </w:tc>
+      </w:tr>
+      <w:tr>
+        <w:trPr>
+          <w:cantSplit/>
+        </w:trPr>
+        <w:tc>
+          <w:tcPr>
+            <w:tcW w:type="dxa" w:w="966"/>
+            <w:tcBorders>
+              <w:top w:val="single" w:sz="4" w:color="D9D9D9"/>
+              <w:left w:val="single" w:sz="4" w:color="D9D9D9"/>
+              <w:bottom w:val="single" w:sz="4" w:color="D9D9D9"/>
+              <w:right w:val="single" w:sz="4" w:color="D9D9D9"/>
+            </w:tcBorders>
+            <w:shd w:val="clear" w:color="auto" w:fill="F6F7F8"/>
+          </w:tcPr>
+          <w:p>
+            <w:pPr>
+              <w:spacing w:after="60" w:before="60"/>
+            </w:pPr>
             <w:r>
               <w:rPr>
                 <w:b w:val="0"/>
                 <w:sz w:val="18"/>
               </w:rPr>
-              <w:t xml:space="preserve"> · </w:t>
-            </w:r>
+              <w:t xml:space="preserve">4–5. Size, giặt</w:t>
+            </w:r>
+          </w:p>
+        </w:tc>
+        <w:tc>
+          <w:tcPr>
+            <w:tcW w:type="dxa" w:w="3037"/>
+            <w:tcBorders>
+              <w:top w:val="single" w:sz="4" w:color="D9D9D9"/>
+              <w:left w:val="single" w:sz="4" w:color="D9D9D9"/>
+              <w:bottom w:val="single" w:sz="4" w:color="D9D9D9"/>
+              <w:right w:val="single" w:sz="4" w:color="D9D9D9"/>
+            </w:tcBorders>
+            <w:shd w:val="clear" w:color="auto" w:fill="F6F7F8"/>
+          </w:tcPr>
+          <w:p>
+            <w:pPr>
+              <w:spacing w:after="60" w:before="60"/>
+            </w:pPr>
             <w:r>
               <w:rPr>
                 <w:b w:val="0"/>
                 <w:rFonts w:ascii="Consolas" w:hAnsi="Consolas" w:cs="Consolas"/>
                 <w:sz w:val="18"/>
               </w:rPr>
-              <w:t xml:space="preserve">CARE – Hand wash only.</w:t>
-            </w:r>
-          </w:p>
-        </w:tc>
-        <w:tc>
-          <w:tcPr>
-            <w:tcW w:type="dxa" w:w="3040"/>
-            <w:tcBorders>
-              <w:top w:val="single" w:sz="4" w:color="D9D9D9"/>
-              <w:left w:val="single" w:sz="4" w:color="D9D9D9"/>
-              <w:bottom w:val="single" w:sz="4" w:color="D9D9D9"/>
-              <w:right w:val="single" w:sz="4" w:color="D9D9D9"/>
-            </w:tcBorders>
-            <w:shd w:val="clear" w:color="auto" w:fill="FFFFFF"/>
-          </w:tcPr>
-          <w:p>
-            <w:pPr>
-              <w:spacing w:after="60" w:before="60"/>
-            </w:pPr>
+              <w:t xml:space="preserve">FIND YOUR SIZE: US size, choose by hip</w:t>
+            </w:r>
+            <w:r>
+              <w:rPr>
+                <w:b w:val="0"/>
+                <w:sz w:val="18"/>
+              </w:rPr>
+              <w:t xml:space="preserve"> · </w:t>
+            </w:r>
             <w:r>
               <w:rPr>
                 <w:b w:val="0"/>
                 <w:rFonts w:ascii="Consolas" w:hAnsi="Consolas" w:cs="Consolas"/>
                 <w:sz w:val="18"/>
               </w:rPr>
-              <w:t xml:space="preserve">FIND YOUR SIZE IN INCHES – S–XXL [ ].</w:t>
-            </w:r>
-            <w:r>
-              <w:rPr>
-                <w:b w:val="0"/>
-                <w:sz w:val="18"/>
-              </w:rPr>
-              <w:t xml:space="preserve"> · </w:t>
-            </w:r>
+              <w:t xml:space="preserve">EASY CARE</w:t>
+            </w:r>
+          </w:p>
+        </w:tc>
+        <w:tc>
+          <w:tcPr>
+            <w:tcW w:type="dxa" w:w="3037"/>
+            <w:tcBorders>
+              <w:top w:val="single" w:sz="4" w:color="D9D9D9"/>
+              <w:left w:val="single" w:sz="4" w:color="D9D9D9"/>
+              <w:bottom w:val="single" w:sz="4" w:color="D9D9D9"/>
+              <w:right w:val="single" w:sz="4" w:color="D9D9D9"/>
+            </w:tcBorders>
+            <w:shd w:val="clear" w:color="auto" w:fill="F6F7F8"/>
+          </w:tcPr>
+          <w:p>
+            <w:pPr>
+              <w:spacing w:after="60" w:before="60"/>
+            </w:pPr>
             <w:r>
               <w:rPr>
                 <w:b w:val="0"/>
                 <w:rFonts w:ascii="Consolas" w:hAnsi="Consolas" w:cs="Consolas"/>
                 <w:sz w:val="18"/>
               </w:rPr>
-              <w:t xml:space="preserve">CARE – Hand wash recommended.</w:t>
+              <w:t xml:space="preserve">FIND YOUR SIZE: S (US 4–6) to XXL (20–22), adjustable drawstring</w:t>
+            </w:r>
+            <w:r>
+              <w:rPr>
+                <w:b w:val="0"/>
+                <w:sz w:val="18"/>
+              </w:rPr>
+              <w:t xml:space="preserve"> · </w:t>
+            </w:r>
+            <w:r>
+              <w:rPr>
+                <w:b w:val="0"/>
+                <w:rFonts w:ascii="Consolas" w:hAnsi="Consolas" w:cs="Consolas"/>
+                <w:sz w:val="18"/>
+              </w:rPr>
+              <w:t xml:space="preserve">EASY CARE</w:t>
+            </w:r>
+          </w:p>
+        </w:tc>
+        <w:tc>
+          <w:tcPr>
+            <w:tcW w:type="dxa" w:w="3040"/>
+            <w:tcBorders>
+              <w:top w:val="single" w:sz="4" w:color="D9D9D9"/>
+              <w:left w:val="single" w:sz="4" w:color="D9D9D9"/>
+              <w:bottom w:val="single" w:sz="4" w:color="D9D9D9"/>
+              <w:right w:val="single" w:sz="4" w:color="D9D9D9"/>
+            </w:tcBorders>
+            <w:shd w:val="clear" w:color="auto" w:fill="F6F7F8"/>
+          </w:tcPr>
+          <w:p>
+            <w:pPr>
+              <w:spacing w:after="60" w:before="60"/>
+            </w:pPr>
+            <w:r>
+              <w:rPr>
+                <w:b w:val="0"/>
+                <w:rFonts w:ascii="Consolas" w:hAnsi="Consolas" w:cs="Consolas"/>
+                <w:sz w:val="18"/>
+              </w:rPr>
+              <w:t xml:space="preserve">FIND YOUR SIZE: choose by bust</w:t>
+            </w:r>
+            <w:r>
+              <w:rPr>
+                <w:b w:val="0"/>
+                <w:sz w:val="18"/>
+              </w:rPr>
+              <w:t xml:space="preserve"> · </w:t>
+            </w:r>
+            <w:r>
+              <w:rPr>
+                <w:b w:val="0"/>
+                <w:rFonts w:ascii="Consolas" w:hAnsi="Consolas" w:cs="Consolas"/>
+                <w:sz w:val="18"/>
+              </w:rPr>
+              <w:t xml:space="preserve">EASY CARE</w:t>
             </w:r>
           </w:p>
         </w:tc>

</xml_diff>

<commit_message>
YC06: hệ thống đo lường, dashboard Excel, cây KPI; đồng bộ units theo tháng ở YC02
Co-Authored-By: Claude Opus 5.5 <noreply@anthropic.com>
Claude-Session: https://claude.ai/code/session_01YQUcqjZGKvmuBKSf6hPFN4
</commit_message>
<xml_diff>
--- a/yeu-cau-02/SIXDO_YeuCau02_ChienLuocAmazon.docx
+++ b/yeu-cau-02/SIXDO_YeuCau02_ChienLuocAmazon.docx
@@ -12058,11 +12058,11 @@
         <w:tblLook w:firstColumn="1" w:firstRow="1" w:lastColumn="0" w:lastRow="0" w:noHBand="0" w:noVBand="1" w:val="04A0"/>
       </w:tblPr>
       <w:tblGrid>
-        <w:gridCol w:w="1802"/>
-        <w:gridCol w:w="4405"/>
-        <w:gridCol w:w="1535"/>
-        <w:gridCol w:w="1535"/>
-        <w:gridCol w:w="803"/>
+        <w:gridCol w:w="1838"/>
+        <w:gridCol w:w="4495"/>
+        <w:gridCol w:w="1566"/>
+        <w:gridCol w:w="1362"/>
+        <w:gridCol w:w="819"/>
       </w:tblGrid>
       <w:tr>
         <w:trPr>
@@ -12071,7 +12071,7 @@
         </w:trPr>
         <w:tc>
           <w:tcPr>
-            <w:tcW w:type="dxa" w:w="1802"/>
+            <w:tcW w:type="dxa" w:w="1838"/>
             <w:tcBorders>
               <w:top w:val="single" w:sz="4" w:color="D9D9D9"/>
               <w:left w:val="single" w:sz="4" w:color="D9D9D9"/>
@@ -12095,7 +12095,7 @@
         </w:tc>
         <w:tc>
           <w:tcPr>
-            <w:tcW w:type="dxa" w:w="4405"/>
+            <w:tcW w:type="dxa" w:w="4495"/>
             <w:tcBorders>
               <w:top w:val="single" w:sz="4" w:color="D9D9D9"/>
               <w:left w:val="single" w:sz="4" w:color="D9D9D9"/>
@@ -12119,7 +12119,7 @@
         </w:tc>
         <w:tc>
           <w:tcPr>
-            <w:tcW w:type="dxa" w:w="1535"/>
+            <w:tcW w:type="dxa" w:w="1566"/>
             <w:tcBorders>
               <w:top w:val="single" w:sz="4" w:color="D9D9D9"/>
               <w:left w:val="single" w:sz="4" w:color="D9D9D9"/>
@@ -12143,7 +12143,7 @@
         </w:tc>
         <w:tc>
           <w:tcPr>
-            <w:tcW w:type="dxa" w:w="1535"/>
+            <w:tcW w:type="dxa" w:w="1362"/>
             <w:tcBorders>
               <w:top w:val="single" w:sz="4" w:color="D9D9D9"/>
               <w:left w:val="single" w:sz="4" w:color="D9D9D9"/>
@@ -12167,7 +12167,7 @@
         </w:tc>
         <w:tc>
           <w:tcPr>
-            <w:tcW w:type="dxa" w:w="803"/>
+            <w:tcW w:type="dxa" w:w="819"/>
             <w:tcBorders>
               <w:top w:val="single" w:sz="4" w:color="D9D9D9"/>
               <w:left w:val="single" w:sz="4" w:color="D9D9D9"/>
@@ -12196,7 +12196,7 @@
         </w:trPr>
         <w:tc>
           <w:tcPr>
-            <w:tcW w:type="dxa" w:w="1802"/>
+            <w:tcW w:type="dxa" w:w="1838"/>
             <w:tcBorders>
               <w:top w:val="single" w:sz="4" w:color="D9D9D9"/>
               <w:left w:val="single" w:sz="4" w:color="D9D9D9"/>
@@ -12220,7 +12220,7 @@
         </w:tc>
         <w:tc>
           <w:tcPr>
-            <w:tcW w:type="dxa" w:w="4405"/>
+            <w:tcW w:type="dxa" w:w="4495"/>
             <w:tcBorders>
               <w:top w:val="single" w:sz="4" w:color="D9D9D9"/>
               <w:left w:val="single" w:sz="4" w:color="D9D9D9"/>
@@ -12244,7 +12244,7 @@
         </w:tc>
         <w:tc>
           <w:tcPr>
-            <w:tcW w:type="dxa" w:w="1535"/>
+            <w:tcW w:type="dxa" w:w="1566"/>
             <w:tcBorders>
               <w:top w:val="single" w:sz="4" w:color="D9D9D9"/>
               <w:left w:val="single" w:sz="4" w:color="D9D9D9"/>
@@ -12262,13 +12262,13 @@
                 <w:b w:val="0"/>
                 <w:sz w:val="16"/>
               </w:rPr>
-              <w:t xml:space="preserve">10 (T10)</w:t>
-            </w:r>
-          </w:p>
-        </w:tc>
-        <w:tc>
-          <w:tcPr>
-            <w:tcW w:type="dxa" w:w="1535"/>
+              <w:t xml:space="preserve">8 (T10)</w:t>
+            </w:r>
+          </w:p>
+        </w:tc>
+        <w:tc>
+          <w:tcPr>
+            <w:tcW w:type="dxa" w:w="1362"/>
             <w:tcBorders>
               <w:top w:val="single" w:sz="4" w:color="D9D9D9"/>
               <w:left w:val="single" w:sz="4" w:color="D9D9D9"/>
@@ -12286,13 +12286,13 @@
                 <w:b w:val="0"/>
                 <w:sz w:val="16"/>
               </w:rPr>
-              <w:t xml:space="preserve">Ghi nhận baseline</w:t>
-            </w:r>
-          </w:p>
-        </w:tc>
-        <w:tc>
-          <w:tcPr>
-            <w:tcW w:type="dxa" w:w="803"/>
+              <w:t xml:space="preserve">Baseline 6%</w:t>
+            </w:r>
+          </w:p>
+        </w:tc>
+        <w:tc>
+          <w:tcPr>
+            <w:tcW w:type="dxa" w:w="819"/>
             <w:tcBorders>
               <w:top w:val="single" w:sz="4" w:color="D9D9D9"/>
               <w:left w:val="single" w:sz="4" w:color="D9D9D9"/>
@@ -12321,7 +12321,7 @@
         </w:trPr>
         <w:tc>
           <w:tcPr>
-            <w:tcW w:type="dxa" w:w="1802"/>
+            <w:tcW w:type="dxa" w:w="1838"/>
             <w:tcBorders>
               <w:top w:val="single" w:sz="4" w:color="D9D9D9"/>
               <w:left w:val="single" w:sz="4" w:color="D9D9D9"/>
@@ -12345,7 +12345,7 @@
         </w:tc>
         <w:tc>
           <w:tcPr>
-            <w:tcW w:type="dxa" w:w="4405"/>
+            <w:tcW w:type="dxa" w:w="4495"/>
             <w:tcBorders>
               <w:top w:val="single" w:sz="4" w:color="D9D9D9"/>
               <w:left w:val="single" w:sz="4" w:color="D9D9D9"/>
@@ -12369,7 +12369,7 @@
         </w:tc>
         <w:tc>
           <w:tcPr>
-            <w:tcW w:type="dxa" w:w="1535"/>
+            <w:tcW w:type="dxa" w:w="1566"/>
             <w:tcBorders>
               <w:top w:val="single" w:sz="4" w:color="D9D9D9"/>
               <w:left w:val="single" w:sz="4" w:color="D9D9D9"/>
@@ -12387,13 +12387,13 @@
                 <w:b w:val="0"/>
                 <w:sz w:val="16"/>
               </w:rPr>
-              <w:t xml:space="preserve">13 (T11)</w:t>
-            </w:r>
-          </w:p>
-        </w:tc>
-        <w:tc>
-          <w:tcPr>
-            <w:tcW w:type="dxa" w:w="1535"/>
+              <w:t xml:space="preserve">11 (T11)</w:t>
+            </w:r>
+          </w:p>
+        </w:tc>
+        <w:tc>
+          <w:tcPr>
+            <w:tcW w:type="dxa" w:w="1362"/>
             <w:tcBorders>
               <w:top w:val="single" w:sz="4" w:color="D9D9D9"/>
               <w:left w:val="single" w:sz="4" w:color="D9D9D9"/>
@@ -12411,13 +12411,13 @@
                 <w:b w:val="0"/>
                 <w:sz w:val="16"/>
               </w:rPr>
-              <w:t xml:space="preserve">7,5% → 9%</w:t>
-            </w:r>
-          </w:p>
-        </w:tc>
-        <w:tc>
-          <w:tcPr>
-            <w:tcW w:type="dxa" w:w="803"/>
+              <w:t xml:space="preserve">6,5%</w:t>
+            </w:r>
+          </w:p>
+        </w:tc>
+        <w:tc>
+          <w:tcPr>
+            <w:tcW w:type="dxa" w:w="819"/>
             <w:tcBorders>
               <w:top w:val="single" w:sz="4" w:color="D9D9D9"/>
               <w:left w:val="single" w:sz="4" w:color="D9D9D9"/>
@@ -12446,7 +12446,7 @@
         </w:trPr>
         <w:tc>
           <w:tcPr>
-            <w:tcW w:type="dxa" w:w="1802"/>
+            <w:tcW w:type="dxa" w:w="1838"/>
             <w:tcBorders>
               <w:top w:val="single" w:sz="4" w:color="D9D9D9"/>
               <w:left w:val="single" w:sz="4" w:color="D9D9D9"/>
@@ -12470,7 +12470,7 @@
         </w:tc>
         <w:tc>
           <w:tcPr>
-            <w:tcW w:type="dxa" w:w="4405"/>
+            <w:tcW w:type="dxa" w:w="4495"/>
             <w:tcBorders>
               <w:top w:val="single" w:sz="4" w:color="D9D9D9"/>
               <w:left w:val="single" w:sz="4" w:color="D9D9D9"/>
@@ -12494,7 +12494,7 @@
         </w:tc>
         <w:tc>
           <w:tcPr>
-            <w:tcW w:type="dxa" w:w="1535"/>
+            <w:tcW w:type="dxa" w:w="1566"/>
             <w:tcBorders>
               <w:top w:val="single" w:sz="4" w:color="D9D9D9"/>
               <w:left w:val="single" w:sz="4" w:color="D9D9D9"/>
@@ -12518,7 +12518,7 @@
         </w:tc>
         <w:tc>
           <w:tcPr>
-            <w:tcW w:type="dxa" w:w="1535"/>
+            <w:tcW w:type="dxa" w:w="1362"/>
             <w:tcBorders>
               <w:top w:val="single" w:sz="4" w:color="D9D9D9"/>
               <w:left w:val="single" w:sz="4" w:color="D9D9D9"/>
@@ -12536,13 +12536,13 @@
                 <w:b w:val="0"/>
                 <w:sz w:val="16"/>
               </w:rPr>
-              <w:t xml:space="preserve">7,5% → 9%</w:t>
-            </w:r>
-          </w:p>
-        </w:tc>
-        <w:tc>
-          <w:tcPr>
-            <w:tcW w:type="dxa" w:w="803"/>
+              <w:t xml:space="preserve">7,5%</w:t>
+            </w:r>
+          </w:p>
+        </w:tc>
+        <w:tc>
+          <w:tcPr>
+            <w:tcW w:type="dxa" w:w="819"/>
             <w:tcBorders>
               <w:top w:val="single" w:sz="4" w:color="D9D9D9"/>
               <w:left w:val="single" w:sz="4" w:color="D9D9D9"/>
@@ -12571,7 +12571,7 @@
         </w:trPr>
         <w:tc>
           <w:tcPr>
-            <w:tcW w:type="dxa" w:w="1802"/>
+            <w:tcW w:type="dxa" w:w="1838"/>
             <w:tcBorders>
               <w:top w:val="single" w:sz="4" w:color="D9D9D9"/>
               <w:left w:val="single" w:sz="4" w:color="D9D9D9"/>
@@ -12595,7 +12595,7 @@
         </w:tc>
         <w:tc>
           <w:tcPr>
-            <w:tcW w:type="dxa" w:w="4405"/>
+            <w:tcW w:type="dxa" w:w="4495"/>
             <w:tcBorders>
               <w:top w:val="single" w:sz="4" w:color="D9D9D9"/>
               <w:left w:val="single" w:sz="4" w:color="D9D9D9"/>
@@ -12619,7 +12619,7 @@
         </w:tc>
         <w:tc>
           <w:tcPr>
-            <w:tcW w:type="dxa" w:w="1535"/>
+            <w:tcW w:type="dxa" w:w="1566"/>
             <w:tcBorders>
               <w:top w:val="single" w:sz="4" w:color="D9D9D9"/>
               <w:left w:val="single" w:sz="4" w:color="D9D9D9"/>
@@ -12637,13 +12637,13 @@
                 <w:b w:val="0"/>
                 <w:sz w:val="16"/>
               </w:rPr>
-              <w:t xml:space="preserve">15 (T1) + 11 (T2)</w:t>
-            </w:r>
-          </w:p>
-        </w:tc>
-        <w:tc>
-          <w:tcPr>
-            <w:tcW w:type="dxa" w:w="1535"/>
+              <w:t xml:space="preserve">15 (T1) + 13 (T2)</w:t>
+            </w:r>
+          </w:p>
+        </w:tc>
+        <w:tc>
+          <w:tcPr>
+            <w:tcW w:type="dxa" w:w="1362"/>
             <w:tcBorders>
               <w:top w:val="single" w:sz="4" w:color="D9D9D9"/>
               <w:left w:val="single" w:sz="4" w:color="D9D9D9"/>
@@ -12661,13 +12661,13 @@
                 <w:b w:val="0"/>
                 <w:sz w:val="16"/>
               </w:rPr>
-              <w:t xml:space="preserve">7,5% → 9%</w:t>
-            </w:r>
-          </w:p>
-        </w:tc>
-        <w:tc>
-          <w:tcPr>
-            <w:tcW w:type="dxa" w:w="803"/>
+              <w:t xml:space="preserve">7,5% → 8,5%</w:t>
+            </w:r>
+          </w:p>
+        </w:tc>
+        <w:tc>
+          <w:tcPr>
+            <w:tcW w:type="dxa" w:w="819"/>
             <w:tcBorders>
               <w:top w:val="single" w:sz="4" w:color="D9D9D9"/>
               <w:left w:val="single" w:sz="4" w:color="D9D9D9"/>
@@ -12696,7 +12696,7 @@
         </w:trPr>
         <w:tc>
           <w:tcPr>
-            <w:tcW w:type="dxa" w:w="1802"/>
+            <w:tcW w:type="dxa" w:w="1838"/>
             <w:tcBorders>
               <w:top w:val="single" w:sz="4" w:color="D9D9D9"/>
               <w:left w:val="single" w:sz="4" w:color="D9D9D9"/>
@@ -12720,7 +12720,7 @@
         </w:tc>
         <w:tc>
           <w:tcPr>
-            <w:tcW w:type="dxa" w:w="4405"/>
+            <w:tcW w:type="dxa" w:w="4495"/>
             <w:tcBorders>
               <w:top w:val="single" w:sz="4" w:color="D9D9D9"/>
               <w:left w:val="single" w:sz="4" w:color="D9D9D9"/>
@@ -12744,7 +12744,7 @@
         </w:tc>
         <w:tc>
           <w:tcPr>
-            <w:tcW w:type="dxa" w:w="1535"/>
+            <w:tcW w:type="dxa" w:w="1566"/>
             <w:tcBorders>
               <w:top w:val="single" w:sz="4" w:color="D9D9D9"/>
               <w:left w:val="single" w:sz="4" w:color="D9D9D9"/>
@@ -12762,13 +12762,13 @@
                 <w:b w:val="0"/>
                 <w:sz w:val="16"/>
               </w:rPr>
-              <w:t xml:space="preserve">10 (T3)</w:t>
-            </w:r>
-          </w:p>
-        </w:tc>
-        <w:tc>
-          <w:tcPr>
-            <w:tcW w:type="dxa" w:w="1535"/>
+              <w:t xml:space="preserve">12 (T3)</w:t>
+            </w:r>
+          </w:p>
+        </w:tc>
+        <w:tc>
+          <w:tcPr>
+            <w:tcW w:type="dxa" w:w="1362"/>
             <w:tcBorders>
               <w:top w:val="single" w:sz="4" w:color="D9D9D9"/>
               <w:left w:val="single" w:sz="4" w:color="D9D9D9"/>
@@ -12786,13 +12786,13 @@
                 <w:b w:val="0"/>
                 <w:sz w:val="16"/>
               </w:rPr>
-              <w:t xml:space="preserve">7,5% → 9%</w:t>
-            </w:r>
-          </w:p>
-        </w:tc>
-        <w:tc>
-          <w:tcPr>
-            <w:tcW w:type="dxa" w:w="803"/>
+              <w:t xml:space="preserve">9%</w:t>
+            </w:r>
+          </w:p>
+        </w:tc>
+        <w:tc>
+          <w:tcPr>
+            <w:tcW w:type="dxa" w:w="819"/>
             <w:tcBorders>
               <w:top w:val="single" w:sz="4" w:color="D9D9D9"/>
               <w:left w:val="single" w:sz="4" w:color="D9D9D9"/>
@@ -12820,6 +12820,20 @@
       <w:pPr>
         <w:spacing w:after="0"/>
       </w:pPr>
+    </w:p>
+    <w:p>
+      <w:pPr>
+        <w:pStyle w:val="ListBullet"/>
+      </w:pPr>
+      <w:r>
+        <w:rPr>
+          <w:b/>
+        </w:rPr>
+        <w:t xml:space="preserve">Units và Unit Session % theo tháng</w:t>
+      </w:r>
+      <w:r>
+        <w:t xml:space="preserve"> là kịch bản cơ sở, tính từ session × CVR tăng dần (Yêu cầu 06 mục 4). Dashboard theo dõi nằm ở Yêu cầu 06.</w:t>
+      </w:r>
     </w:p>
     <w:p>
       <w:pPr>

</xml_diff>